<commit_message>
Response letter: fix "BCAT opinion component" → "proposed model" for Table 1 consistency
Co-Authored-By: Claude Opus 4.6 (1M context) <noreply@anthropic.com>
</commit_message>
<xml_diff>
--- a/Response to Reviewers.docx
+++ b/Response to Reviewers.docx
@@ -1139,7 +1139,43 @@
           <w:sz w:val="24"/>
           <w:szCs w:val="24"/>
         </w:rPr>
-        <w:t xml:space="preserve"> (Fig1.tif–Fig12.tif), multi-panel figures combined with embedded panel labels, TIFF format at 300 DPI, and proper in-text citations.</w:t>
+        <w:t xml:space="preserve"> (</w:t>
+      </w:r>
+      <w:r>
+        <w:rPr>
+          <w:rFonts w:ascii="Book Antiqua" w:eastAsia="Times New Roman" w:hAnsi="Book Antiqua"/>
+          <w:color w:val="0070C0"/>
+          <w:sz w:val="24"/>
+          <w:szCs w:val="24"/>
+        </w:rPr>
+        <w:t>f</w:t>
+      </w:r>
+      <w:r>
+        <w:rPr>
+          <w:rFonts w:ascii="Book Antiqua" w:eastAsia="Times New Roman" w:hAnsi="Book Antiqua"/>
+          <w:color w:val="0070C0"/>
+          <w:sz w:val="24"/>
+          <w:szCs w:val="24"/>
+        </w:rPr>
+        <w:t>ig1.tif–</w:t>
+      </w:r>
+      <w:r>
+        <w:rPr>
+          <w:rFonts w:ascii="Book Antiqua" w:eastAsia="Times New Roman" w:hAnsi="Book Antiqua"/>
+          <w:color w:val="0070C0"/>
+          <w:sz w:val="24"/>
+          <w:szCs w:val="24"/>
+        </w:rPr>
+        <w:t>f</w:t>
+      </w:r>
+      <w:r>
+        <w:rPr>
+          <w:rFonts w:ascii="Book Antiqua" w:eastAsia="Times New Roman" w:hAnsi="Book Antiqua"/>
+          <w:color w:val="0070C0"/>
+          <w:sz w:val="24"/>
+          <w:szCs w:val="24"/>
+        </w:rPr>
+        <w:t>ig12.tif), multi-panel figures combined with embedded panel labels, TIFF format at 300 DPI, and proper in-text citations.</w:t>
       </w:r>
     </w:p>
     <w:p>
@@ -2206,7 +2242,39 @@
           <w:sz w:val="24"/>
           <w:szCs w:val="24"/>
         </w:rPr>
-        <w:t>At the end of the Related Models section, a paragraph argues why bounded confidence, rather than DeGroot-style averaging (Golub &amp; Jackson, 2010, 2012; Cheng et al., 2026) or voter model dynamics</w:t>
+        <w:t xml:space="preserve">At the end of the Related Models section, </w:t>
+      </w:r>
+      <w:r>
+        <w:rPr>
+          <w:rFonts w:ascii="Book Antiqua" w:eastAsia="Times New Roman" w:hAnsi="Book Antiqua"/>
+          <w:sz w:val="24"/>
+          <w:szCs w:val="24"/>
+        </w:rPr>
+        <w:t>two</w:t>
+      </w:r>
+      <w:r>
+        <w:rPr>
+          <w:rFonts w:ascii="Book Antiqua" w:eastAsia="Times New Roman" w:hAnsi="Book Antiqua"/>
+          <w:sz w:val="24"/>
+          <w:szCs w:val="24"/>
+        </w:rPr>
+        <w:t xml:space="preserve"> paragraph</w:t>
+      </w:r>
+      <w:r>
+        <w:rPr>
+          <w:rFonts w:ascii="Book Antiqua" w:eastAsia="Times New Roman" w:hAnsi="Book Antiqua"/>
+          <w:sz w:val="24"/>
+          <w:szCs w:val="24"/>
+        </w:rPr>
+        <w:t>s</w:t>
+      </w:r>
+      <w:r>
+        <w:rPr>
+          <w:rFonts w:ascii="Book Antiqua" w:eastAsia="Times New Roman" w:hAnsi="Book Antiqua"/>
+          <w:sz w:val="24"/>
+          <w:szCs w:val="24"/>
+        </w:rPr>
+        <w:t xml:space="preserve"> argue why bounded confidence, rather than DeGroot-style averaging (Golub &amp; Jackson, 2010, 2012; Cheng et al., 2026) or voter model dynamics</w:t>
       </w:r>
       <w:r>
         <w:rPr>
@@ -3531,7 +3599,23 @@
           <w:sz w:val="24"/>
           <w:szCs w:val="24"/>
         </w:rPr>
-        <w:t xml:space="preserve"> the BCAT opinion update mechanism as a networked, discretized, adoption-status-conditioned extension of the simple Deffuant bounded confidence model (Deffuant et al., 2000). A new comparative table (Table 1) summarizes the structural relationships among the HKmodel, the Deffuant RA model, and the BCAT opinion component across eight dimensions. We rewrote the Algorithm 3 description in the Simulation Model Specifications section to specify the fixed-rate convergence rule, </w:t>
+        <w:t xml:space="preserve"> the BCAT opinion update mechanism as a networked, discretized, adoption-status-conditioned extension of the simple Deffuant bounded confidence model (Deffuant et al., 2000). A new comparative table (Table 1) summarizes the structural relationships among the HKmodel, the Deffuant RA model, and the</w:t>
+      </w:r>
+      <w:r>
+        <w:rPr>
+          <w:rFonts w:ascii="Book Antiqua" w:eastAsia="Times New Roman" w:hAnsi="Book Antiqua"/>
+          <w:sz w:val="24"/>
+          <w:szCs w:val="24"/>
+        </w:rPr>
+        <w:t xml:space="preserve"> proposed model </w:t>
+      </w:r>
+      <w:r>
+        <w:rPr>
+          <w:rFonts w:ascii="Book Antiqua" w:eastAsia="Times New Roman" w:hAnsi="Book Antiqua"/>
+          <w:sz w:val="24"/>
+          <w:szCs w:val="24"/>
+        </w:rPr>
+        <w:t xml:space="preserve">across eight dimensions. We rewrote the Algorithm 3 description in the Simulation Model Specifications section to specify the fixed-rate convergence rule, </w:t>
       </w:r>
       <w:r>
         <w:rPr>
@@ -3698,7 +3782,7 @@
           <w:sz w:val="24"/>
           <w:szCs w:val="24"/>
         </w:rPr>
-        <w:t xml:space="preserve"> randomness therefore comes from four well-defined stochastic elements: (1) the random selection of a neighbor for each agent per tick, (2) the initial random assignment of attitude and threshold values, (3) the random or clustered placement of pioneer agents, and (4) the random execution order within each tick. Because each source is controlled and reproducible </w:t>
+        <w:t xml:space="preserve"> randomness therefore comes from four well-defined stochastic elements: (1) the random selection of a neighbor for each agent per tick, (2) the initial random assignment of attitude and threshold values, (3) the random or clustered placement of pioneer agents, and (4) the random execution order within each tick. Because each source is controlled and reproducible given a fixed random seed, the sensitivity analysis results reported in the Results section </w:t>
       </w:r>
       <w:r>
         <w:rPr>
@@ -3707,7 +3791,7 @@
           <w:szCs w:val="24"/>
         </w:rPr>
         <w:lastRenderedPageBreak/>
-        <w:t>given a fixed random seed, the sensitivity analysis results reported in the Results section reflect model parameter effects rather than systematic scheduling artifacts.</w:t>
+        <w:t>reflect model parameter effects rather than systematic scheduling artifacts.</w:t>
       </w:r>
     </w:p>
     <w:p>
@@ -3901,45 +3985,45 @@
           <w:sz w:val="24"/>
           <w:szCs w:val="24"/>
         </w:rPr>
+        <w:t>These</w:t>
+      </w:r>
+      <w:r>
+        <w:rPr>
+          <w:rFonts w:ascii="Book Antiqua" w:eastAsia="Times New Roman" w:hAnsi="Book Antiqua"/>
+          <w:sz w:val="24"/>
+          <w:szCs w:val="24"/>
+        </w:rPr>
+        <w:t xml:space="preserve"> changes</w:t>
+      </w:r>
+      <w:r>
+        <w:rPr>
+          <w:rFonts w:ascii="Book Antiqua" w:eastAsia="Times New Roman" w:hAnsi="Book Antiqua"/>
+          <w:sz w:val="24"/>
+          <w:szCs w:val="24"/>
+        </w:rPr>
+        <w:t xml:space="preserve"> do not require modifications</w:t>
+      </w:r>
+      <w:r>
+        <w:rPr>
+          <w:rFonts w:ascii="Book Antiqua" w:eastAsia="Times New Roman" w:hAnsi="Book Antiqua"/>
+          <w:sz w:val="24"/>
+          <w:szCs w:val="24"/>
+        </w:rPr>
+        <w:t xml:space="preserve"> to the simulation code or model behavior.</w:t>
+      </w:r>
+    </w:p>
+    <w:p>
+      <w:pPr>
+        <w:pStyle w:val="2"/>
+        <w:rPr>
+          <w:rFonts w:ascii="Book Antiqua" w:hAnsi="Book Antiqua"/>
+        </w:rPr>
+      </w:pPr>
+      <w:r>
+        <w:rPr>
+          <w:rFonts w:ascii="Book Antiqua" w:hAnsi="Book Antiqua"/>
+        </w:rPr>
         <w:lastRenderedPageBreak/>
-        <w:t>These</w:t>
-      </w:r>
-      <w:r>
-        <w:rPr>
-          <w:rFonts w:ascii="Book Antiqua" w:eastAsia="Times New Roman" w:hAnsi="Book Antiqua"/>
-          <w:sz w:val="24"/>
-          <w:szCs w:val="24"/>
-        </w:rPr>
-        <w:t xml:space="preserve"> changes</w:t>
-      </w:r>
-      <w:r>
-        <w:rPr>
-          <w:rFonts w:ascii="Book Antiqua" w:eastAsia="Times New Roman" w:hAnsi="Book Antiqua"/>
-          <w:sz w:val="24"/>
-          <w:szCs w:val="24"/>
-        </w:rPr>
-        <w:t xml:space="preserve"> do not require modifications</w:t>
-      </w:r>
-      <w:r>
-        <w:rPr>
-          <w:rFonts w:ascii="Book Antiqua" w:eastAsia="Times New Roman" w:hAnsi="Book Antiqua"/>
-          <w:sz w:val="24"/>
-          <w:szCs w:val="24"/>
-        </w:rPr>
-        <w:t xml:space="preserve"> to the simulation code or model behavior.</w:t>
-      </w:r>
-    </w:p>
-    <w:p>
-      <w:pPr>
-        <w:pStyle w:val="2"/>
-        <w:rPr>
-          <w:rFonts w:ascii="Book Antiqua" w:hAnsi="Book Antiqua"/>
-        </w:rPr>
-      </w:pPr>
-      <w:r>
-        <w:rPr>
-          <w:rFonts w:ascii="Book Antiqua" w:hAnsi="Book Antiqua"/>
-        </w:rPr>
         <w:t>R2-4. Incomplete Statistical Reporting in Table 3</w:t>
       </w:r>
     </w:p>
@@ -4175,7 +4259,23 @@
           <w:sz w:val="24"/>
           <w:szCs w:val="24"/>
         </w:rPr>
-        <w:t xml:space="preserve"> independently in sensitivity analysis design, the predictors are </w:t>
+        <w:t xml:space="preserve"> independently in sensitivity analysis design, the predictors are approximately orthogonal</w:t>
+      </w:r>
+      <w:r>
+        <w:rPr>
+          <w:rFonts w:ascii="Book Antiqua" w:eastAsia="Times New Roman" w:hAnsi="Book Antiqua"/>
+          <w:sz w:val="24"/>
+          <w:szCs w:val="24"/>
+        </w:rPr>
+        <w:t>,</w:t>
+      </w:r>
+      <w:r>
+        <w:rPr>
+          <w:rFonts w:ascii="Book Antiqua" w:eastAsia="Times New Roman" w:hAnsi="Book Antiqua"/>
+          <w:sz w:val="24"/>
+          <w:szCs w:val="24"/>
+        </w:rPr>
+        <w:t xml:space="preserve"> and the two measures mathematically equivalent under this </w:t>
       </w:r>
       <w:r>
         <w:rPr>
@@ -4184,23 +4284,7 @@
           <w:szCs w:val="24"/>
         </w:rPr>
         <w:lastRenderedPageBreak/>
-        <w:t>approximately orthogonal</w:t>
-      </w:r>
-      <w:r>
-        <w:rPr>
-          <w:rFonts w:ascii="Book Antiqua" w:eastAsia="Times New Roman" w:hAnsi="Book Antiqua"/>
-          <w:sz w:val="24"/>
-          <w:szCs w:val="24"/>
-        </w:rPr>
-        <w:t>,</w:t>
-      </w:r>
-      <w:r>
-        <w:rPr>
-          <w:rFonts w:ascii="Book Antiqua" w:eastAsia="Times New Roman" w:hAnsi="Book Antiqua"/>
-          <w:sz w:val="24"/>
-          <w:szCs w:val="24"/>
-        </w:rPr>
-        <w:t xml:space="preserve"> and the two measures mathematically equivalent under this condition.</w:t>
+        <w:t>condition.</w:t>
       </w:r>
     </w:p>
     <w:p>
@@ -4253,7 +4337,7 @@
           <w:sz w:val="24"/>
           <w:szCs w:val="24"/>
         </w:rPr>
-        <w:t xml:space="preserve">To establish robustness we conducted finite-size scaling experiments at N=400 (20×20), N=900 (30×30), N=1,600 (40×40), and N=2,500 (50×50), using identical parameter configurations (avg-of-attitudes=50, std-of-attitudes=15, bounded-confidence=50, avg-of-thresholds from 10 to 70, 30 replications per configuration). Our results confirm that the “best game no one played” phenomenon—high FRI coexisting with near-zero GSI—persisted at all system sizes, and that the observed adoption failure is a robust collective behavior rather than a stochastic artifact of the N=400 baseline. The sharp phase transition at avg-of-thresholds between 30 and 40, and the dominance of avg-of-thresholds as the primary determinant of adoption outcomes, held across all system sizes. We added a note at the end of the sensitivity analysis subsection in our revised Results section. </w:t>
+        <w:t xml:space="preserve">To establish robustness we conducted finite-size scaling experiments at N=400 (20×20), N=900 (30×30), N=1,600 (40×40), and N=2,500 (50×50), using identical parameter configurations (avg-of-attitudes=50, std-of-attitudes=15, bounded-confidence=50, avg-of-thresholds from 10 to 70). Our results confirm that the “best game no one played” phenomenon—high FRI coexisting with near-zero GSI—persisted at all system sizes, and that the observed adoption failure is a robust collective behavior rather than a stochastic artifact of the N=400 baseline. The sharp phase transition at avg-of-thresholds between 30 and 40, and the dominance of avg-of-thresholds as the primary determinant of adoption outcomes, held across all system sizes. We added a note at the end of the sensitivity analysis subsection in our revised Results section. </w:t>
       </w:r>
       <w:r>
         <w:rPr>

</xml_diff>

<commit_message>
Add response letter PDF; fix diff figures; update CLAUDE.md and README.md
- Added Response to Reviewers.pdf (for Editorial Manager upload)
- manuscript-diff.pdf: fixed Fig 7/8/9 clipping by removing broken
  latexdiff minipage markup and using clean [H] float placement
- CLAUDE.md: updated response letter files, next steps (upload PDF)
- README.md: added Response to Reviewers.pdf to repo structure

Co-Authored-By: Claude Opus 4.6 (1M context) <noreply@anthropic.com>
</commit_message>
<xml_diff>
--- a/Response to Reviewers.docx
+++ b/Response to Reviewers.docx
@@ -197,7 +197,7 @@
         <w:spacing w:afterLines="50" w:after="120" w:line="360" w:lineRule="auto"/>
         <w:ind w:leftChars="200" w:left="440" w:rightChars="200" w:right="440"/>
         <w:rPr>
-          <w:rFonts w:ascii="Book Antiqua" w:eastAsia="Times New Roman" w:hAnsi="Book Antiqua" w:hint="eastAsia"/>
+          <w:rFonts w:ascii="Book Antiqua" w:eastAsia="Times New Roman" w:hAnsi="Book Antiqua"/>
           <w:sz w:val="24"/>
           <w:szCs w:val="24"/>
         </w:rPr>
@@ -6526,7 +6526,7 @@
         <w:spacing w:afterLines="50" w:after="120" w:line="360" w:lineRule="auto"/>
         <w:ind w:left="482" w:hanging="482"/>
         <w:rPr>
-          <w:rFonts w:ascii="Book Antiqua" w:hAnsi="Book Antiqua" w:hint="eastAsia"/>
+          <w:rFonts w:ascii="Book Antiqua" w:hAnsi="Book Antiqua"/>
           <w:sz w:val="24"/>
           <w:szCs w:val="24"/>
         </w:rPr>

</xml_diff>

<commit_message>
Response letter: add FRI=0.618 small-world value to R1-2 for consistency with manuscript L599
Co-Authored-By: Claude Opus 4.6 (1M context) <noreply@anthropic.com>
</commit_message>
<xml_diff>
--- a/Response to Reviewers.docx
+++ b/Response to Reviewers.docx
@@ -2939,43 +2939,25 @@
           <w:sz w:val="24"/>
           <w:szCs w:val="24"/>
         </w:rPr>
-        <w:t xml:space="preserve"> (1) the MD-A experiment reveals a phase transition in coordination failure between avg-of-thresholds = 30 (GSI = 0.976) and 40 (GSI = 0.026); (2) the MD-B experiment shows that opinion clustering alone reduce</w:t>
-      </w:r>
-      <w:r>
-        <w:rPr>
-          <w:rFonts w:ascii="Book Antiqua" w:eastAsia="Times New Roman" w:hAnsi="Book Antiqua"/>
-          <w:color w:val="0070C0"/>
-          <w:sz w:val="24"/>
-          <w:szCs w:val="24"/>
-        </w:rPr>
-        <w:t>d the</w:t>
-      </w:r>
-      <w:r>
-        <w:rPr>
-          <w:rFonts w:ascii="Book Antiqua" w:eastAsia="Times New Roman" w:hAnsi="Book Antiqua"/>
-          <w:color w:val="0070C0"/>
-          <w:sz w:val="24"/>
-          <w:szCs w:val="24"/>
-        </w:rPr>
-        <w:t xml:space="preserve"> FRI </w:t>
-      </w:r>
-      <w:r>
-        <w:rPr>
-          <w:rFonts w:ascii="Book Antiqua" w:eastAsia="Times New Roman" w:hAnsi="Book Antiqua"/>
-          <w:color w:val="0070C0"/>
-          <w:sz w:val="24"/>
-          <w:szCs w:val="24"/>
-        </w:rPr>
-        <w:t xml:space="preserve">value </w:t>
-      </w:r>
-      <w:r>
-        <w:rPr>
-          <w:rFonts w:ascii="Book Antiqua" w:eastAsia="Times New Roman" w:hAnsi="Book Antiqua"/>
-          <w:color w:val="0070C0"/>
-          <w:sz w:val="24"/>
-          <w:szCs w:val="24"/>
-        </w:rPr>
-        <w:t xml:space="preserve">to 0.600; </w:t>
+        <w:t xml:space="preserve"> (1) the MD-A experiment reveals a phase transition in coordination failure between avg-of-thresholds = 30 (GSI = 0.976) and 40 (GSI = 0.026); (2) </w:t>
+      </w:r>
+      <w:r>
+        <w:rPr>
+          <w:rFonts w:ascii="Book Antiqua" w:eastAsia="Times New Roman" w:hAnsi="Book Antiqua"/>
+          <w:color w:val="0070C0"/>
+          <w:sz w:val="24"/>
+          <w:szCs w:val="24"/>
+        </w:rPr>
+        <w:t>the MD-B experiment shows that opinion clustering alone reduced the FRI value to 0.600 in the regular lattice and 0.618 in the small-world network</w:t>
+      </w:r>
+      <w:r>
+        <w:rPr>
+          <w:rFonts w:ascii="Book Antiqua" w:eastAsia="Times New Roman" w:hAnsi="Book Antiqua"/>
+          <w:color w:val="0070C0"/>
+          <w:sz w:val="24"/>
+          <w:szCs w:val="24"/>
+        </w:rPr>
+        <w:t xml:space="preserve">; </w:t>
       </w:r>
       <w:r>
         <w:rPr>

</xml_diff>

<commit_message>
Streamline CLAUDE.md and align README.md formatting
- CLAUDE.md: condensed from 447 to ~120 lines; removed redundant
  TEX-vs-DOCX paragraph-level comparison logs, deep comparison rounds,
  and intermediate check details; retained all fix records, key decisions,
  verification results, and submission checklist
- README.md: aligned Response to Reviewers indentation in repo structure

Co-Authored-By: Claude Opus 4.6 (1M context) <noreply@anthropic.com>
</commit_message>
<xml_diff>
--- a/Response to Reviewers.docx
+++ b/Response to Reviewers.docx
@@ -2939,25 +2939,43 @@
           <w:sz w:val="24"/>
           <w:szCs w:val="24"/>
         </w:rPr>
-        <w:t xml:space="preserve"> (1) the MD-A experiment reveals a phase transition in coordination failure between avg-of-thresholds = 30 (GSI = 0.976) and 40 (GSI = 0.026); (2) </w:t>
-      </w:r>
-      <w:r>
-        <w:rPr>
-          <w:rFonts w:ascii="Book Antiqua" w:eastAsia="Times New Roman" w:hAnsi="Book Antiqua"/>
-          <w:color w:val="0070C0"/>
-          <w:sz w:val="24"/>
-          <w:szCs w:val="24"/>
-        </w:rPr>
-        <w:t>the MD-B experiment shows that opinion clustering alone reduced the FRI value to 0.600 in the regular lattice and 0.618 in the small-world network</w:t>
-      </w:r>
-      <w:r>
-        <w:rPr>
-          <w:rFonts w:ascii="Book Antiqua" w:eastAsia="Times New Roman" w:hAnsi="Book Antiqua"/>
-          <w:color w:val="0070C0"/>
-          <w:sz w:val="24"/>
-          <w:szCs w:val="24"/>
-        </w:rPr>
-        <w:t xml:space="preserve">; </w:t>
+        <w:t xml:space="preserve"> (1) the MD-A experiment reveals a phase transition in coordination failure between avg-of-thresholds = 30 (GSI = 0.976) and 40 (GSI = 0.026); (2) the MD-B experiment shows that opinion clustering alone reduce</w:t>
+      </w:r>
+      <w:r>
+        <w:rPr>
+          <w:rFonts w:ascii="Book Antiqua" w:eastAsia="Times New Roman" w:hAnsi="Book Antiqua"/>
+          <w:color w:val="0070C0"/>
+          <w:sz w:val="24"/>
+          <w:szCs w:val="24"/>
+        </w:rPr>
+        <w:t>d the</w:t>
+      </w:r>
+      <w:r>
+        <w:rPr>
+          <w:rFonts w:ascii="Book Antiqua" w:eastAsia="Times New Roman" w:hAnsi="Book Antiqua"/>
+          <w:color w:val="0070C0"/>
+          <w:sz w:val="24"/>
+          <w:szCs w:val="24"/>
+        </w:rPr>
+        <w:t xml:space="preserve"> FRI </w:t>
+      </w:r>
+      <w:r>
+        <w:rPr>
+          <w:rFonts w:ascii="Book Antiqua" w:eastAsia="Times New Roman" w:hAnsi="Book Antiqua"/>
+          <w:color w:val="0070C0"/>
+          <w:sz w:val="24"/>
+          <w:szCs w:val="24"/>
+        </w:rPr>
+        <w:t xml:space="preserve">value </w:t>
+      </w:r>
+      <w:r>
+        <w:rPr>
+          <w:rFonts w:ascii="Book Antiqua" w:eastAsia="Times New Roman" w:hAnsi="Book Antiqua"/>
+          <w:color w:val="0070C0"/>
+          <w:sz w:val="24"/>
+          <w:szCs w:val="24"/>
+        </w:rPr>
+        <w:t xml:space="preserve">to 0.600; </w:t>
       </w:r>
       <w:r>
         <w:rPr>

</xml_diff>